<commit_message>
Sprint 3: Updated database design documentation
</commit_message>
<xml_diff>
--- a/contractiq,sprint3.docx
+++ b/contractiq,sprint3.docx
@@ -282,8 +282,6 @@
           <w:szCs w:val="28"/>
         </w:rPr>
       </w:pPr>
-      <w:bookmarkStart w:id="0" w:name="_GoBack"/>
-      <w:bookmarkEnd w:id="0"/>
       <w:r>
         <w:rPr>
           <w:rFonts w:ascii="Times New Roman" w:eastAsia="Times New Roman" w:hAnsi="Times New Roman" w:cs="Times New Roman"/>
@@ -13951,6 +13949,69 @@
           <w:szCs w:val="28"/>
         </w:rPr>
       </w:pPr>
+    </w:p>
+    <w:p>
+      <w:pPr>
+        <w:pStyle w:val="Heading1"/>
+        <w:rPr>
+          <w:sz w:val="28"/>
+          <w:szCs w:val="28"/>
+        </w:rPr>
+      </w:pPr>
+    </w:p>
+    <w:p>
+      <w:pPr>
+        <w:pStyle w:val="Heading1"/>
+        <w:rPr>
+          <w:sz w:val="28"/>
+          <w:szCs w:val="28"/>
+        </w:rPr>
+      </w:pPr>
+    </w:p>
+    <w:p>
+      <w:pPr>
+        <w:pStyle w:val="Heading1"/>
+        <w:rPr>
+          <w:sz w:val="28"/>
+          <w:szCs w:val="28"/>
+        </w:rPr>
+      </w:pPr>
+    </w:p>
+    <w:p>
+      <w:pPr>
+        <w:pStyle w:val="Heading1"/>
+        <w:rPr>
+          <w:sz w:val="28"/>
+          <w:szCs w:val="28"/>
+        </w:rPr>
+      </w:pPr>
+    </w:p>
+    <w:p>
+      <w:pPr>
+        <w:pStyle w:val="Heading1"/>
+        <w:rPr>
+          <w:sz w:val="28"/>
+          <w:szCs w:val="28"/>
+        </w:rPr>
+      </w:pPr>
+    </w:p>
+    <w:p>
+      <w:pPr>
+        <w:pStyle w:val="Heading1"/>
+        <w:rPr>
+          <w:sz w:val="28"/>
+          <w:szCs w:val="28"/>
+        </w:rPr>
+      </w:pPr>
+    </w:p>
+    <w:p>
+      <w:pPr>
+        <w:pStyle w:val="Heading1"/>
+        <w:rPr>
+          <w:sz w:val="28"/>
+          <w:szCs w:val="28"/>
+        </w:rPr>
+      </w:pPr>
       <w:r>
         <w:rPr>
           <w:sz w:val="28"/>
@@ -14016,7 +14077,6 @@
         <w:rPr>
           <w:rFonts w:ascii="Times New Roman" w:hAnsi="Times New Roman" w:cs="Times New Roman"/>
         </w:rPr>
-        <w:lastRenderedPageBreak/>
         <w:t>contracts</w:t>
       </w:r>
     </w:p>
@@ -14262,11 +14322,12 @@
         <w:rPr>
           <w:noProof/>
         </w:rPr>
+        <w:lastRenderedPageBreak/>
         <w:drawing>
           <wp:inline distT="0" distB="0" distL="0" distR="0">
-            <wp:extent cx="6821424" cy="3913632"/>
-            <wp:effectExtent l="0" t="0" r="0" b="0"/>
-            <wp:docPr id="4" name="Picture 4" descr="C:\Users\USER\Downloads\Untitled (1).png"/>
+            <wp:extent cx="5641340" cy="9523730"/>
+            <wp:effectExtent l="0" t="0" r="0" b="1270"/>
+            <wp:docPr id="9" name="Picture 9" descr="C:\Users\USER\Pictures\Camera Roll\ERDf.png"/>
             <wp:cNvGraphicFramePr>
               <a:graphicFrameLocks xmlns:a="http://schemas.openxmlformats.org/drawingml/2006/main" noChangeAspect="1"/>
             </wp:cNvGraphicFramePr>
@@ -14274,13 +14335,13 @@
               <a:graphicData uri="http://schemas.openxmlformats.org/drawingml/2006/picture">
                 <pic:pic xmlns:pic="http://schemas.openxmlformats.org/drawingml/2006/picture">
                   <pic:nvPicPr>
-                    <pic:cNvPr id="0" name="Picture 13" descr="C:\Users\USER\Downloads\Untitled (1).png"/>
+                    <pic:cNvPr id="0" name="Picture 16" descr="C:\Users\USER\Pictures\Camera Roll\ERDf.png"/>
                     <pic:cNvPicPr>
                       <a:picLocks noChangeAspect="1" noChangeArrowheads="1"/>
                     </pic:cNvPicPr>
                   </pic:nvPicPr>
                   <pic:blipFill>
-                    <a:blip r:embed="rId6" cstate="print">
+                    <a:blip r:embed="rId6">
                       <a:extLst>
                         <a:ext uri="{28A0092B-C50C-407E-A947-70E740481C1C}">
                           <a14:useLocalDpi xmlns:a14="http://schemas.microsoft.com/office/drawing/2010/main" val="0"/>
@@ -14295,7 +14356,7 @@
                   <pic:spPr bwMode="auto">
                     <a:xfrm>
                       <a:off x="0" y="0"/>
-                      <a:ext cx="6821424" cy="3913632"/>
+                      <a:ext cx="5641340" cy="9523730"/>
                     </a:xfrm>
                     <a:prstGeom prst="rect">
                       <a:avLst/>
@@ -14314,19 +14375,8 @@
     </w:p>
     <w:p>
       <w:pPr>
-        <w:pStyle w:val="NoSpacing"/>
-        <w:rPr>
-          <w:rFonts w:ascii="Times New Roman" w:eastAsia="Times New Roman" w:hAnsi="Times New Roman" w:cs="Times New Roman"/>
-          <w:sz w:val="24"/>
-          <w:szCs w:val="24"/>
-        </w:rPr>
-      </w:pPr>
-    </w:p>
-    <w:p>
-      <w:pPr>
-        <w:pStyle w:val="NoSpacing"/>
-        <w:rPr>
-          <w:rFonts w:ascii="Times New Roman" w:hAnsi="Times New Roman" w:cs="Times New Roman"/>
+        <w:pStyle w:val="NormalWeb"/>
+        <w:rPr>
           <w:b/>
           <w:sz w:val="28"/>
           <w:szCs w:val="28"/>
@@ -14335,9 +14385,8 @@
     </w:p>
     <w:p>
       <w:pPr>
-        <w:pStyle w:val="NoSpacing"/>
-        <w:rPr>
-          <w:rFonts w:ascii="Times New Roman" w:hAnsi="Times New Roman" w:cs="Times New Roman"/>
+        <w:pStyle w:val="NormalWeb"/>
+        <w:rPr>
           <w:b/>
           <w:sz w:val="28"/>
           <w:szCs w:val="28"/>
@@ -14346,420 +14395,223 @@
     </w:p>
     <w:p>
       <w:pPr>
-        <w:pStyle w:val="NoSpacing"/>
-        <w:rPr>
-          <w:rFonts w:ascii="Times New Roman" w:hAnsi="Times New Roman" w:cs="Times New Roman"/>
+        <w:pStyle w:val="NormalWeb"/>
+      </w:pPr>
+      <w:r>
+        <w:rPr>
           <w:b/>
           <w:sz w:val="28"/>
           <w:szCs w:val="28"/>
         </w:rPr>
-      </w:pPr>
-    </w:p>
-    <w:p>
-      <w:pPr>
-        <w:pStyle w:val="NoSpacing"/>
-        <w:rPr>
-          <w:rFonts w:ascii="Times New Roman" w:hAnsi="Times New Roman" w:cs="Times New Roman"/>
+        <w:t xml:space="preserve">7. </w:t>
+      </w:r>
+      <w:r>
+        <w:rPr>
           <w:b/>
           <w:sz w:val="28"/>
           <w:szCs w:val="28"/>
         </w:rPr>
-      </w:pPr>
-      <w:r>
+        <w:t>Database Design Explanation:</w:t>
+      </w:r>
+    </w:p>
+    <w:p>
+      <w:pPr>
+        <w:pStyle w:val="NoSpacing"/>
+        <w:jc w:val="center"/>
         <w:rPr>
           <w:rFonts w:ascii="Times New Roman" w:hAnsi="Times New Roman" w:cs="Times New Roman"/>
+        </w:rPr>
+      </w:pPr>
+    </w:p>
+    <w:p>
+      <w:pPr>
+        <w:pStyle w:val="NoSpacing"/>
+        <w:jc w:val="center"/>
+        <w:rPr>
+          <w:rFonts w:ascii="Times New Roman" w:hAnsi="Times New Roman" w:cs="Times New Roman"/>
+        </w:rPr>
+      </w:pPr>
+    </w:p>
+    <w:p>
+      <w:pPr>
+        <w:pStyle w:val="NoSpacing"/>
+        <w:jc w:val="center"/>
+        <w:rPr>
+          <w:rFonts w:ascii="Times New Roman" w:hAnsi="Times New Roman" w:cs="Times New Roman"/>
+        </w:rPr>
+      </w:pPr>
+      <w:r>
+        <w:rPr>
+          <w:rFonts w:ascii="Times New Roman" w:hAnsi="Times New Roman" w:cs="Times New Roman"/>
+          <w:noProof/>
+        </w:rPr>
+        <w:drawing>
+          <wp:inline distT="0" distB="0" distL="0" distR="0">
+            <wp:extent cx="2714813" cy="4701485"/>
+            <wp:effectExtent l="0" t="0" r="0" b="4445"/>
+            <wp:docPr id="7" name="Picture 7" descr="C:\Users\USER\Pictures\Screenshots\Screenshot 2026-08-11 001822.png"/>
+            <wp:cNvGraphicFramePr>
+              <a:graphicFrameLocks xmlns:a="http://schemas.openxmlformats.org/drawingml/2006/main" noChangeAspect="1"/>
+            </wp:cNvGraphicFramePr>
+            <a:graphic xmlns:a="http://schemas.openxmlformats.org/drawingml/2006/main">
+              <a:graphicData uri="http://schemas.openxmlformats.org/drawingml/2006/picture">
+                <pic:pic xmlns:pic="http://schemas.openxmlformats.org/drawingml/2006/picture">
+                  <pic:nvPicPr>
+                    <pic:cNvPr id="0" name="Picture 13" descr="C:\Users\USER\Pictures\Screenshots\Screenshot 2026-08-11 001822.png"/>
+                    <pic:cNvPicPr>
+                      <a:picLocks noChangeAspect="1" noChangeArrowheads="1"/>
+                    </pic:cNvPicPr>
+                  </pic:nvPicPr>
+                  <pic:blipFill>
+                    <a:blip r:embed="rId7">
+                      <a:extLst>
+                        <a:ext uri="{28A0092B-C50C-407E-A947-70E740481C1C}">
+                          <a14:useLocalDpi xmlns:a14="http://schemas.microsoft.com/office/drawing/2010/main" val="0"/>
+                        </a:ext>
+                      </a:extLst>
+                    </a:blip>
+                    <a:srcRect/>
+                    <a:stretch>
+                      <a:fillRect/>
+                    </a:stretch>
+                  </pic:blipFill>
+                  <pic:spPr bwMode="auto">
+                    <a:xfrm>
+                      <a:off x="0" y="0"/>
+                      <a:ext cx="2730136" cy="4728021"/>
+                    </a:xfrm>
+                    <a:prstGeom prst="rect">
+                      <a:avLst/>
+                    </a:prstGeom>
+                    <a:noFill/>
+                    <a:ln>
+                      <a:noFill/>
+                    </a:ln>
+                  </pic:spPr>
+                </pic:pic>
+              </a:graphicData>
+            </a:graphic>
+          </wp:inline>
+        </w:drawing>
+      </w:r>
+    </w:p>
+    <w:p>
+      <w:pPr>
+        <w:pStyle w:val="NormalWeb"/>
+      </w:pPr>
+      <w:r>
+        <w:t xml:space="preserve">The workflow starts with </w:t>
+      </w:r>
+      <w:r>
+        <w:rPr>
+          <w:rStyle w:val="Strong"/>
+        </w:rPr>
+        <w:t>Users</w:t>
+      </w:r>
+      <w:r>
+        <w:t xml:space="preserve">, who manage </w:t>
+      </w:r>
+      <w:r>
+        <w:rPr>
+          <w:rStyle w:val="Strong"/>
+        </w:rPr>
+        <w:t>Contracts</w:t>
+      </w:r>
+      <w:r>
+        <w:t xml:space="preserve"> in the system. Each contract can have multiple </w:t>
+      </w:r>
+      <w:r>
+        <w:rPr>
+          <w:rStyle w:val="Strong"/>
+        </w:rPr>
+        <w:t>Contract Versions</w:t>
+      </w:r>
+      <w:r>
+        <w:t xml:space="preserve"> and </w:t>
+      </w:r>
+      <w:r>
+        <w:rPr>
+          <w:rStyle w:val="Strong"/>
+        </w:rPr>
+        <w:t>Obligations</w:t>
+      </w:r>
+      <w:r>
+        <w:t xml:space="preserve">. The system also tracks </w:t>
+      </w:r>
+      <w:r>
+        <w:rPr>
+          <w:rStyle w:val="Strong"/>
+        </w:rPr>
+        <w:t>Renewals</w:t>
+      </w:r>
+      <w:r>
+        <w:t xml:space="preserve"> for contracts and sends </w:t>
+      </w:r>
+      <w:r>
+        <w:rPr>
+          <w:rStyle w:val="Strong"/>
+        </w:rPr>
+        <w:t>Notifications</w:t>
+      </w:r>
+      <w:r>
+        <w:t xml:space="preserve"> for important dates and activities. The information from these modules can be used to generate </w:t>
+      </w:r>
+      <w:r>
+        <w:rPr>
+          <w:rStyle w:val="Strong"/>
+        </w:rPr>
+        <w:t>Reports</w:t>
+      </w:r>
+      <w:r>
+        <w:t>.</w:t>
+      </w:r>
+    </w:p>
+    <w:p>
+      <w:pPr>
+        <w:pStyle w:val="NormalWeb"/>
+      </w:pPr>
+      <w:r>
+        <w:rPr>
+          <w:rStyle w:val="Strong"/>
+        </w:rPr>
+        <w:t>Activities</w:t>
+      </w:r>
+      <w:r>
+        <w:t xml:space="preserve"> record actions performed by users on contracts. </w:t>
+      </w:r>
+      <w:r>
+        <w:rPr>
+          <w:rStyle w:val="Strong"/>
+        </w:rPr>
+        <w:t>Audit Logs</w:t>
+      </w:r>
+      <w:r>
+        <w:t xml:space="preserve"> maintain important records of these activities and changes, helping the system keep track of what happened.</w:t>
+      </w:r>
+    </w:p>
+    <w:p>
+      <w:pPr>
+        <w:pStyle w:val="NormalWeb"/>
+        <w:rPr>
           <w:b/>
           <w:sz w:val="28"/>
           <w:szCs w:val="28"/>
         </w:rPr>
-        <w:t xml:space="preserve">7. </w:t>
-      </w:r>
-      <w:r>
-        <w:rPr>
-          <w:rFonts w:ascii="Times New Roman" w:hAnsi="Times New Roman" w:cs="Times New Roman"/>
+      </w:pPr>
+      <w:r>
+        <w:rPr>
           <w:b/>
           <w:sz w:val="28"/>
           <w:szCs w:val="28"/>
         </w:rPr>
-        <w:t>Database Design Explanation:</w:t>
+        <w:t>Conclusion:</w:t>
       </w:r>
     </w:p>
     <w:p>
       <w:pPr>
-        <w:pStyle w:val="NoSpacing"/>
-        <w:jc w:val="center"/>
-        <w:rPr>
-          <w:rFonts w:ascii="Times New Roman" w:hAnsi="Times New Roman" w:cs="Times New Roman"/>
-        </w:rPr>
-      </w:pPr>
-    </w:p>
-    <w:p>
-      <w:pPr>
-        <w:pStyle w:val="NoSpacing"/>
-        <w:jc w:val="center"/>
-        <w:rPr>
-          <w:rFonts w:ascii="Times New Roman" w:hAnsi="Times New Roman" w:cs="Times New Roman"/>
-        </w:rPr>
-      </w:pPr>
-      <w:r>
-        <w:rPr>
-          <w:rFonts w:ascii="Times New Roman" w:hAnsi="Times New Roman" w:cs="Times New Roman"/>
-        </w:rPr>
-        <w:t>User</w:t>
-      </w:r>
-    </w:p>
-    <w:p>
-      <w:pPr>
-        <w:pStyle w:val="NoSpacing"/>
-        <w:jc w:val="center"/>
-        <w:rPr>
-          <w:rFonts w:ascii="Times New Roman" w:hAnsi="Times New Roman" w:cs="Times New Roman"/>
-        </w:rPr>
-      </w:pPr>
-      <w:r>
-        <w:rPr>
-          <w:rFonts w:ascii="Times New Roman" w:hAnsi="Times New Roman" w:cs="Times New Roman"/>
-        </w:rPr>
-        <w:t>↓</w:t>
-      </w:r>
-    </w:p>
-    <w:p>
-      <w:pPr>
-        <w:pStyle w:val="NoSpacing"/>
-        <w:jc w:val="center"/>
-        <w:rPr>
-          <w:rFonts w:ascii="Times New Roman" w:hAnsi="Times New Roman" w:cs="Times New Roman"/>
-        </w:rPr>
-      </w:pPr>
-      <w:r>
-        <w:rPr>
-          <w:rFonts w:ascii="Times New Roman" w:hAnsi="Times New Roman" w:cs="Times New Roman"/>
-        </w:rPr>
-        <w:t>Contract</w:t>
-      </w:r>
-    </w:p>
-    <w:p>
-      <w:pPr>
-        <w:pStyle w:val="NoSpacing"/>
-        <w:jc w:val="center"/>
-        <w:rPr>
-          <w:rFonts w:ascii="Times New Roman" w:hAnsi="Times New Roman" w:cs="Times New Roman"/>
-        </w:rPr>
-      </w:pPr>
-      <w:r>
-        <w:rPr>
-          <w:rFonts w:ascii="Times New Roman" w:hAnsi="Times New Roman" w:cs="Times New Roman"/>
-        </w:rPr>
-        <w:t>↓</w:t>
-      </w:r>
-    </w:p>
-    <w:p>
-      <w:pPr>
-        <w:pStyle w:val="NoSpacing"/>
-        <w:jc w:val="center"/>
-        <w:rPr>
-          <w:rFonts w:ascii="Times New Roman" w:hAnsi="Times New Roman" w:cs="Times New Roman"/>
-        </w:rPr>
-      </w:pPr>
-      <w:r>
-        <w:rPr>
-          <w:rFonts w:ascii="Times New Roman" w:hAnsi="Times New Roman" w:cs="Times New Roman"/>
-        </w:rPr>
-        <w:lastRenderedPageBreak/>
-        <w:t>Contract Versions</w:t>
-      </w:r>
-    </w:p>
-    <w:p>
-      <w:pPr>
-        <w:pStyle w:val="NoSpacing"/>
-        <w:jc w:val="center"/>
-        <w:rPr>
-          <w:rFonts w:ascii="Times New Roman" w:hAnsi="Times New Roman" w:cs="Times New Roman"/>
-        </w:rPr>
-      </w:pPr>
-      <w:r>
-        <w:rPr>
-          <w:rFonts w:ascii="Times New Roman" w:hAnsi="Times New Roman" w:cs="Times New Roman"/>
-        </w:rPr>
-        <w:t>↓</w:t>
-      </w:r>
-    </w:p>
-    <w:p>
-      <w:pPr>
-        <w:pStyle w:val="NoSpacing"/>
-        <w:jc w:val="center"/>
-        <w:rPr>
-          <w:rFonts w:ascii="Times New Roman" w:hAnsi="Times New Roman" w:cs="Times New Roman"/>
-        </w:rPr>
-      </w:pPr>
-      <w:r>
-        <w:rPr>
-          <w:rFonts w:ascii="Times New Roman" w:hAnsi="Times New Roman" w:cs="Times New Roman"/>
-        </w:rPr>
-        <w:t>Obligations</w:t>
-      </w:r>
-    </w:p>
-    <w:p>
-      <w:pPr>
-        <w:pStyle w:val="NoSpacing"/>
-        <w:jc w:val="center"/>
-        <w:rPr>
-          <w:rFonts w:ascii="Times New Roman" w:hAnsi="Times New Roman" w:cs="Times New Roman"/>
-        </w:rPr>
-      </w:pPr>
-      <w:r>
-        <w:rPr>
-          <w:rFonts w:ascii="Times New Roman" w:hAnsi="Times New Roman" w:cs="Times New Roman"/>
-        </w:rPr>
-        <w:t>↓</w:t>
-      </w:r>
-    </w:p>
-    <w:p>
-      <w:pPr>
-        <w:pStyle w:val="NoSpacing"/>
-        <w:jc w:val="center"/>
-        <w:rPr>
-          <w:rFonts w:ascii="Times New Roman" w:hAnsi="Times New Roman" w:cs="Times New Roman"/>
-        </w:rPr>
-      </w:pPr>
-      <w:r>
-        <w:rPr>
-          <w:rFonts w:ascii="Times New Roman" w:hAnsi="Times New Roman" w:cs="Times New Roman"/>
-        </w:rPr>
-        <w:t>Renewals</w:t>
-      </w:r>
-    </w:p>
-    <w:p>
-      <w:pPr>
-        <w:pStyle w:val="NoSpacing"/>
-        <w:jc w:val="center"/>
-        <w:rPr>
-          <w:rFonts w:ascii="Times New Roman" w:hAnsi="Times New Roman" w:cs="Times New Roman"/>
-        </w:rPr>
-      </w:pPr>
-      <w:r>
-        <w:rPr>
-          <w:rFonts w:ascii="Times New Roman" w:hAnsi="Times New Roman" w:cs="Times New Roman"/>
-        </w:rPr>
-        <w:t>↓</w:t>
-      </w:r>
-    </w:p>
-    <w:p>
-      <w:pPr>
-        <w:pStyle w:val="NoSpacing"/>
-        <w:jc w:val="center"/>
-        <w:rPr>
-          <w:rFonts w:ascii="Times New Roman" w:hAnsi="Times New Roman" w:cs="Times New Roman"/>
-        </w:rPr>
-      </w:pPr>
-      <w:r>
-        <w:rPr>
-          <w:rFonts w:ascii="Times New Roman" w:hAnsi="Times New Roman" w:cs="Times New Roman"/>
-        </w:rPr>
-        <w:t>Notifications</w:t>
-      </w:r>
-    </w:p>
-    <w:p>
-      <w:pPr>
-        <w:pStyle w:val="NoSpacing"/>
-        <w:jc w:val="center"/>
-        <w:rPr>
-          <w:rFonts w:ascii="Times New Roman" w:hAnsi="Times New Roman" w:cs="Times New Roman"/>
-        </w:rPr>
-      </w:pPr>
-      <w:r>
-        <w:rPr>
-          <w:rFonts w:ascii="Times New Roman" w:hAnsi="Times New Roman" w:cs="Times New Roman"/>
-        </w:rPr>
-        <w:t>↓</w:t>
-      </w:r>
-    </w:p>
-    <w:p>
-      <w:pPr>
-        <w:pStyle w:val="NoSpacing"/>
-        <w:jc w:val="center"/>
-        <w:rPr>
-          <w:rFonts w:ascii="Times New Roman" w:hAnsi="Times New Roman" w:cs="Times New Roman"/>
-        </w:rPr>
-      </w:pPr>
-      <w:r>
-        <w:rPr>
-          <w:rFonts w:ascii="Times New Roman" w:hAnsi="Times New Roman" w:cs="Times New Roman"/>
-        </w:rPr>
-        <w:t>Reports</w:t>
-      </w:r>
-    </w:p>
-    <w:p>
-      <w:pPr>
-        <w:pStyle w:val="NoSpacing"/>
-        <w:jc w:val="center"/>
-        <w:rPr>
-          <w:rFonts w:ascii="Times New Roman" w:hAnsi="Times New Roman" w:cs="Times New Roman"/>
-        </w:rPr>
-      </w:pPr>
-    </w:p>
-    <w:p>
-      <w:pPr>
-        <w:pStyle w:val="NoSpacing"/>
-        <w:jc w:val="center"/>
-        <w:rPr>
-          <w:rFonts w:ascii="Times New Roman" w:hAnsi="Times New Roman" w:cs="Times New Roman"/>
-        </w:rPr>
-      </w:pPr>
-      <w:r>
-        <w:rPr>
-          <w:rFonts w:ascii="Times New Roman" w:hAnsi="Times New Roman" w:cs="Times New Roman"/>
-        </w:rPr>
-        <w:t>Users + Contracts + Activities</w:t>
-      </w:r>
-    </w:p>
-    <w:p>
-      <w:pPr>
-        <w:pStyle w:val="NoSpacing"/>
-        <w:jc w:val="center"/>
-        <w:rPr>
-          <w:rFonts w:ascii="Times New Roman" w:hAnsi="Times New Roman" w:cs="Times New Roman"/>
-        </w:rPr>
-      </w:pPr>
-      <w:r>
-        <w:rPr>
-          <w:rFonts w:ascii="Times New Roman" w:hAnsi="Times New Roman" w:cs="Times New Roman"/>
-        </w:rPr>
-        <w:t>↓</w:t>
-      </w:r>
-    </w:p>
-    <w:p>
-      <w:pPr>
-        <w:pStyle w:val="NoSpacing"/>
-        <w:jc w:val="center"/>
-        <w:rPr>
-          <w:rFonts w:ascii="Times New Roman" w:hAnsi="Times New Roman" w:cs="Times New Roman"/>
-        </w:rPr>
-      </w:pPr>
-      <w:r>
-        <w:rPr>
-          <w:rFonts w:ascii="Times New Roman" w:hAnsi="Times New Roman" w:cs="Times New Roman"/>
-        </w:rPr>
-        <w:t>Audit Logs</w:t>
-      </w:r>
-    </w:p>
-    <w:p>
-      <w:pPr>
         <w:pStyle w:val="NormalWeb"/>
       </w:pPr>
       <w:r>
-        <w:t xml:space="preserve">The workflow starts with </w:t>
-      </w:r>
-      <w:r>
-        <w:rPr>
-          <w:rStyle w:val="Strong"/>
-        </w:rPr>
-        <w:t>Users</w:t>
-      </w:r>
-      <w:r>
-        <w:t xml:space="preserve">, who manage </w:t>
-      </w:r>
-      <w:r>
-        <w:rPr>
-          <w:rStyle w:val="Strong"/>
-        </w:rPr>
-        <w:t>Contracts</w:t>
-      </w:r>
-      <w:r>
-        <w:t xml:space="preserve"> in the system. Each contract can have multiple </w:t>
-      </w:r>
-      <w:r>
-        <w:rPr>
-          <w:rStyle w:val="Strong"/>
-        </w:rPr>
-        <w:t>Contract Versions</w:t>
-      </w:r>
-      <w:r>
-        <w:t xml:space="preserve"> and </w:t>
-      </w:r>
-      <w:r>
-        <w:rPr>
-          <w:rStyle w:val="Strong"/>
-        </w:rPr>
-        <w:t>Obligations</w:t>
-      </w:r>
-      <w:r>
-        <w:t xml:space="preserve">. The system also tracks </w:t>
-      </w:r>
-      <w:r>
-        <w:rPr>
-          <w:rStyle w:val="Strong"/>
-        </w:rPr>
-        <w:t>Renewals</w:t>
-      </w:r>
-      <w:r>
-        <w:t xml:space="preserve"> for contracts and sends </w:t>
-      </w:r>
-      <w:r>
-        <w:rPr>
-          <w:rStyle w:val="Strong"/>
-        </w:rPr>
-        <w:t>Notifications</w:t>
-      </w:r>
-      <w:r>
-        <w:t xml:space="preserve"> for important dates and activities. The information from these modules can be used to generate </w:t>
-      </w:r>
-      <w:r>
-        <w:rPr>
-          <w:rStyle w:val="Strong"/>
-        </w:rPr>
-        <w:t>Reports</w:t>
-      </w:r>
-      <w:r>
-        <w:t>.</w:t>
-      </w:r>
-    </w:p>
-    <w:p>
-      <w:pPr>
-        <w:pStyle w:val="NormalWeb"/>
-      </w:pPr>
-      <w:r>
-        <w:rPr>
-          <w:rStyle w:val="Strong"/>
-        </w:rPr>
-        <w:t>Activities</w:t>
-      </w:r>
-      <w:r>
-        <w:t xml:space="preserve"> record actions performed by users on contracts. </w:t>
-      </w:r>
-      <w:r>
-        <w:rPr>
-          <w:rStyle w:val="Strong"/>
-        </w:rPr>
-        <w:t>Audit Logs</w:t>
-      </w:r>
-      <w:r>
-        <w:t xml:space="preserve"> maintain important records of these activities and changes, helping the system keep track of what happened.</w:t>
-      </w:r>
-    </w:p>
-    <w:p>
-      <w:pPr>
-        <w:pStyle w:val="NormalWeb"/>
-        <w:rPr>
-          <w:b/>
-          <w:sz w:val="28"/>
-          <w:szCs w:val="28"/>
-        </w:rPr>
-      </w:pPr>
-      <w:r>
-        <w:rPr>
-          <w:b/>
-          <w:sz w:val="28"/>
-          <w:szCs w:val="28"/>
-        </w:rPr>
-        <w:t>Conclusion:</w:t>
-      </w:r>
-    </w:p>
-    <w:p>
-      <w:pPr>
-        <w:pStyle w:val="NormalWeb"/>
-      </w:pPr>
-      <w:r>
         <w:t xml:space="preserve">The database design provides a simple and organized structure for the </w:t>
       </w:r>
       <w:proofErr w:type="spellStart"/>
@@ -14768,103 +14620,13 @@
       </w:r>
       <w:proofErr w:type="spellEnd"/>
       <w:r>
-        <w:t xml:space="preserve"> application. The tables are connected to manage users, contracts, obligations, renewals, notifications, reports, and activity records efficiently. This design will serve as a foundation for developing the database and backend features in future sprints.</w:t>
-      </w:r>
-    </w:p>
-    <w:p>
-      <w:pPr>
-        <w:pStyle w:val="NormalWeb"/>
-      </w:pPr>
-    </w:p>
-    <w:p>
-      <w:pPr>
-        <w:pStyle w:val="NormalWeb"/>
-      </w:pPr>
-    </w:p>
-    <w:p>
-      <w:pPr>
-        <w:pStyle w:val="NormalWeb"/>
-      </w:pPr>
-    </w:p>
-    <w:p>
-      <w:pPr>
-        <w:spacing w:before="100" w:beforeAutospacing="1" w:after="100" w:afterAutospacing="1" w:line="240" w:lineRule="auto"/>
-        <w:ind w:left="720"/>
-        <w:rPr>
-          <w:rFonts w:ascii="Times New Roman" w:hAnsi="Times New Roman" w:cs="Times New Roman"/>
-        </w:rPr>
-      </w:pPr>
-    </w:p>
-    <w:p>
-      <w:pPr>
-        <w:spacing w:before="100" w:beforeAutospacing="1" w:after="100" w:afterAutospacing="1" w:line="240" w:lineRule="auto"/>
-        <w:rPr>
-          <w:rFonts w:ascii="Times New Roman" w:hAnsi="Times New Roman" w:cs="Times New Roman"/>
-        </w:rPr>
-      </w:pPr>
-    </w:p>
-    <w:p>
-      <w:pPr>
-        <w:pStyle w:val="NormalWeb"/>
-      </w:pPr>
-    </w:p>
-    <w:p>
-      <w:pPr>
-        <w:spacing w:before="100" w:beforeAutospacing="1" w:after="100" w:afterAutospacing="1" w:line="240" w:lineRule="auto"/>
-        <w:rPr>
-          <w:rFonts w:ascii="Times New Roman" w:hAnsi="Times New Roman" w:cs="Times New Roman"/>
-        </w:rPr>
-      </w:pPr>
-    </w:p>
-    <w:p>
-      <w:pPr>
-        <w:spacing w:before="100" w:beforeAutospacing="1" w:after="100" w:afterAutospacing="1" w:line="240" w:lineRule="auto"/>
-        <w:rPr>
-          <w:rFonts w:ascii="Times New Roman" w:hAnsi="Times New Roman" w:cs="Times New Roman"/>
-        </w:rPr>
-      </w:pPr>
-    </w:p>
-    <w:p>
-      <w:pPr>
-        <w:rPr>
-          <w:rFonts w:ascii="Times New Roman" w:hAnsi="Times New Roman" w:cs="Times New Roman"/>
-        </w:rPr>
-      </w:pPr>
-    </w:p>
-    <w:p>
-      <w:pPr>
-        <w:rPr>
-          <w:rFonts w:ascii="Times New Roman" w:hAnsi="Times New Roman" w:cs="Times New Roman"/>
-        </w:rPr>
-      </w:pPr>
-    </w:p>
-    <w:p>
-      <w:pPr>
-        <w:rPr>
-          <w:rFonts w:ascii="Times New Roman" w:hAnsi="Times New Roman" w:cs="Times New Roman"/>
-        </w:rPr>
-      </w:pPr>
-    </w:p>
-    <w:p>
-      <w:pPr>
-        <w:rPr>
-          <w:rFonts w:ascii="Times New Roman" w:hAnsi="Times New Roman" w:cs="Times New Roman"/>
-        </w:rPr>
-      </w:pPr>
-    </w:p>
-    <w:p>
-      <w:pPr>
-        <w:rPr>
-          <w:rFonts w:ascii="Times New Roman" w:hAnsi="Times New Roman" w:cs="Times New Roman"/>
-        </w:rPr>
-      </w:pPr>
-    </w:p>
-    <w:p>
-      <w:pPr>
-        <w:rPr>
-          <w:rFonts w:ascii="Times New Roman" w:hAnsi="Times New Roman" w:cs="Times New Roman"/>
-        </w:rPr>
-      </w:pPr>
+        <w:t xml:space="preserve"> application. The tables are connected to manage users, contracts, obligations, renewals, notifications, reports, and activity records efficiently. This design will serve as a foundation for developing the database and back</w:t>
+      </w:r>
+      <w:r>
+        <w:t>end features in future sprints.</w:t>
+      </w:r>
+      <w:bookmarkStart w:id="0" w:name="_GoBack"/>
+      <w:bookmarkEnd w:id="0"/>
     </w:p>
     <w:sectPr>
       <w:pgSz w:w="12240" w:h="15840"/>
@@ -16610,7 +16372,6 @@
     <w:name w:val="Normal (Web)"/>
     <w:basedOn w:val="Normal"/>
     <w:uiPriority w:val="99"/>
-    <w:semiHidden/>
     <w:unhideWhenUsed/>
     <w:rsid w:val="00F324A0"/>
     <w:pPr>
@@ -16978,7 +16739,7 @@
 </file>
 
 <file path=customXml/itemProps1.xml><?xml version="1.0" encoding="utf-8"?>
-<ds:datastoreItem xmlns:ds="http://schemas.openxmlformats.org/officeDocument/2006/customXml" ds:itemID="{F6CC7432-1ECD-4AE9-A5A8-3918EFAFAF48}">
+<ds:datastoreItem xmlns:ds="http://schemas.openxmlformats.org/officeDocument/2006/customXml" ds:itemID="{E351ED40-5797-49C1-93A4-C98E80FD1BD8}">
   <ds:schemaRefs>
     <ds:schemaRef ds:uri="http://schemas.openxmlformats.org/officeDocument/2006/bibliography"/>
   </ds:schemaRefs>

</xml_diff>